<commit_message>
draft(UNAPPROVED): deepen HCO MOM.1–11 from Guidebook interpretations
Keep portal PDF OE text, counts, levels, CORE flags and asterisks unchanged.
Add 68 Guidebook Interpretation method notes (scanned PDF md5 2c4489ee,
OCR pages 149–175). Judgment calls resolved: 11/68, stop-work on 3/4/6/7/9,
MOM.9 NDPS statute P2, titles as printed.

Co-authored-by: upadhyaymehul9-prog <upadhyaymehul9-prog@users.noreply.github.com>
</commit_message>
<xml_diff>
--- a/policies/build/masters_hco/HCO.MOM.10_v2_master.docx
+++ b/policies/build/masters_hco/HCO.MOM.10_v2_master.docx
@@ -773,7 +773,7 @@
           <w:sz w:val="22"/>
           <w:szCs w:val="22"/>
         </w:rPr>
-        <w:t xml:space="preserve">Boundaries: do not copy SHCO MOM wording. Do not overwrite HCO AAC or COP policies. Spell out abbreviations on first use in training materials. Guidebook Interpretation paragraphs were not available for MOM in this drafting environment — methods follow official OE text and chapter intent.</w:t>
+        <w:t xml:space="preserve">Boundaries: do not copy SHCO MOM wording. Do not overwrite HCO AAC or COP policies. Spell out abbreviations on first use in training materials. OE counts/levels/asterisks stay with the official portal Standards PDF. Method notes come from the Guidebook Interpretation paragraphs (scanned PDF md5 2c4489ee98de4ae9b49cba168ea9f42a).</w:t>
       </w:r>
     </w:p>
     <w:p>
@@ -934,6 +934,18 @@
     </w:p>
     <w:p>
       <w:pPr>
+        <w:spacing w:after="140"/>
+      </w:pPr>
+      <w:r>
+        <w:rPr>
+          <w:sz w:val="22"/>
+          <w:szCs w:val="22"/>
+        </w:rPr>
+        <w:t xml:space="preserve">Method note (from guidebook interpretation): The organisation shall ensure that relevant and sufficient scientific data are available before selection. It shall also look for any international (for example US-FDA) or national notification or applicable regulations (Central Drugs Standard Control Organisation notification based on the Drugs and Cosmetics Act) for approval of the particular product. The multidisciplinary committee shall be responsible for approving the use of a particular implant.</w:t>
+      </w:r>
+    </w:p>
+    <w:p>
+      <w:pPr>
         <w:pStyle w:val="Heading2"/>
         <w:spacing w:after="100" w:before="220"/>
       </w:pPr>
@@ -974,6 +986,18 @@
           <w:sz w:val="22"/>
           <w:szCs w:val="22"/>
         </w:rPr>
+        <w:t xml:space="preserve">Method note (from guidebook interpretation): The organisation shall have written guidance to direct procurement, storage/stocking, issuing and usage of implantable prosthesis and medical devices. Infection prevention and control requirement related to use of prosthesis and medical devices is implemented. This shall address statutory regulations/guidelines and manufacturer’s recommendation(s)</w:t>
+      </w:r>
+    </w:p>
+    <w:p>
+      <w:pPr>
+        <w:spacing w:after="140"/>
+      </w:pPr>
+      <w:r>
+        <w:rPr>
+          <w:sz w:val="22"/>
+          <w:szCs w:val="22"/>
+        </w:rPr>
         <w:t xml:space="preserve">This objective element is asterisked in the official Standards PDF — documentation of the process is required.</w:t>
       </w:r>
     </w:p>
@@ -1012,6 +1036,18 @@
     </w:p>
     <w:p>
       <w:pPr>
+        <w:spacing w:after="140"/>
+      </w:pPr>
+      <w:r>
+        <w:rPr>
+          <w:sz w:val="22"/>
+          <w:szCs w:val="22"/>
+        </w:rPr>
+        <w:t xml:space="preserve">Method note (from guidebook interpretation): Precautions could include non-usage of specific drugs and reporting to the hospital if a particular symptom occurs. The organisation shall document the details of counselling provided to the patient/ his or her family in informed consent.</w:t>
+      </w:r>
+    </w:p>
+    <w:p>
+      <w:pPr>
         <w:pStyle w:val="Heading2"/>
         <w:spacing w:after="100" w:before="220"/>
       </w:pPr>
@@ -1045,6 +1081,18 @@
     </w:p>
     <w:p>
       <w:pPr>
+        <w:spacing w:after="140"/>
+      </w:pPr>
+      <w:r>
+        <w:rPr>
+          <w:sz w:val="22"/>
+          <w:szCs w:val="22"/>
+        </w:rPr>
+        <w:t xml:space="preserve">Method note (from guidebook interpretation): \n case where implantable prosthesis do not have pre-labelled stickers, the organisation shall have suitable mechanisms in place for identifying the implant (manufacturer, type, size, batch number, serial number and any other important detail)</w:t>
+      </w:r>
+    </w:p>
+    <w:p>
+      <w:pPr>
         <w:pStyle w:val="Heading2"/>
         <w:spacing w:after="100" w:before="220"/>
       </w:pPr>
@@ -1074,6 +1122,18 @@
           <w:szCs w:val="22"/>
         </w:rPr>
         <w:t xml:space="preserve">The recall file holds the notice, patients identified, actions taken and closure. This asterisked Achievement element is evidenced by a drill or a real recall file, not by a sentence in this policy.</w:t>
+      </w:r>
+    </w:p>
+    <w:p>
+      <w:pPr>
+        <w:spacing w:after="140"/>
+      </w:pPr>
+      <w:r>
+        <w:rPr>
+          <w:sz w:val="22"/>
+          <w:szCs w:val="22"/>
+        </w:rPr>
+        <w:t xml:space="preserve">Method note (from guidebook interpretation): Process of recall may be based on communication from regulatory authorities, manufacturer or internal feedback. Recall procedure in response to internal feedback also includes providing information to appropriate regulatory authority and the manufacturer. The record shall be maintained on occurrence. Refer to MOM.1.e. and FMS.5.g. —) Commitment al Achievement 4 Excellence — , : NABH Standard Medical supplies and consumables are stored appropriately and are MOM.11. 2 . available where required.</w:t>
       </w:r>
     </w:p>
     <w:p>
@@ -2224,7 +2284,7 @@
           <w:sz w:val="22"/>
           <w:szCs w:val="22"/>
         </w:rPr>
-        <w:t xml:space="preserve">National Accreditation Board for Hospitals and Healthcare Providers (NABH), Accreditation Standards for Hospitals, 6th Edition (January 2025) — Management of Medication, standard MOM.10. Official portal PDF.</w:t>
+        <w:t xml:space="preserve">National Accreditation Board for Hospitals and Healthcare Providers (NABH), Accreditation Standards for Hospitals, 6th Edition (January 2025) — Management of Medication, standard MOM.10. Official portal PDF (OE text, counts, levels, asterisks).</w:t>
       </w:r>
     </w:p>
     <w:p>
@@ -2241,7 +2301,24 @@
           <w:sz w:val="22"/>
           <w:szCs w:val="22"/>
         </w:rPr>
-        <w:t xml:space="preserve">Internal documents of «Hospital Name»: written guidance, formulary, high-risk and emergency-medication lists, registers and incident forms named for MOM.10.</w:t>
+        <w:t xml:space="preserve">NABH Guidebook to Accreditation Standards for Hospitals, 6th Edition — MOM.10 interpretations (source PDF md5 2c4489ee98de4ae9b49cba168ea9f42a; OCR policies/source/hco6_mom_guidebook_ocr.txt).</w:t>
+      </w:r>
+    </w:p>
+    <w:p>
+      <w:pPr>
+        <w:pStyle w:val="ListParagraph"/>
+        <w:numPr>
+          <w:ilvl w:val="0"/>
+          <w:numId w:val="1"/>
+        </w:numPr>
+        <w:spacing w:after="60"/>
+      </w:pPr>
+      <w:r>
+        <w:rPr>
+          <w:sz w:val="22"/>
+          <w:szCs w:val="22"/>
+        </w:rPr>
+        <w:t xml:space="preserve">Internal documents of «Hospital Name»: Medication Management Manual, formulary, high-risk and emergency-medication lists, registers and incident forms named for MOM.10.</w:t>
       </w:r>
     </w:p>
     <w:p>

</xml_diff>